<commit_message>
fix(us-submission): align 20618 inventor signature with general layout
</commit_message>
<xml_diff>
--- a/scripts/report/submission/templates/20618/Assignment-20618-inventors.docx
+++ b/scripts/report/submission/templates/20618/Assignment-20618-inventors.docx
@@ -712,30 +712,11 @@
         <w:tblLook w:val="0000" w:firstRow="0" w:lastRow="0" w:firstColumn="0" w:lastColumn="0" w:noHBand="0" w:noVBand="0"/>
       </w:tblPr>
       <w:tblGrid>
-        <w:gridCol w:w="865"/>
         <w:gridCol w:w="1120"/>
-        <w:gridCol w:w="1417"/>
         <w:gridCol w:w="1843"/>
         <w:gridCol w:w="4394"/>
       </w:tblGrid>
       <w:tr>
-        <w:tc>
-          <w:tcPr>
-            <w:tcW w:w="865" w:type="dxa"/>
-            <w:tcBorders>
-              <w:top w:val="none" w:sz="4" w:space="0" w:color="000000"/>
-              <w:left w:val="none" w:sz="4" w:space="0" w:color="000000"/>
-              <w:bottom w:val="none" w:sz="4" w:space="0" w:color="000000"/>
-              <w:right w:val="none" w:sz="4" w:space="0" w:color="000000"/>
-            </w:tcBorders>
-          </w:tcPr>
-          <w:p>
-            <w:pPr>
-              <w:pStyle w:val="30"/>
-              <w:keepNext/>
-            </w:pPr>
-          </w:p>
-        </w:tc>
         <w:tc>
           <w:tcPr>
             <w:tcW w:w="1120" w:type="dxa"/>
@@ -754,23 +735,6 @@
             <w:r>
               <w:t>Assignor</w:t>
             </w:r>
-          </w:p>
-        </w:tc>
-        <w:tc>
-          <w:tcPr>
-            <w:tcW w:w="1417" w:type="dxa"/>
-            <w:tcBorders>
-              <w:top w:val="none" w:sz="4" w:space="0" w:color="000000"/>
-              <w:left w:val="none" w:sz="4" w:space="0" w:color="000000"/>
-              <w:bottom w:val="none" w:sz="4" w:space="0" w:color="000000"/>
-              <w:right w:val="none" w:sz="4" w:space="0" w:color="000000"/>
-            </w:tcBorders>
-          </w:tcPr>
-          <w:p>
-            <w:pPr>
-              <w:pStyle w:val="30"/>
-              <w:keepNext/>
-            </w:pPr>
           </w:p>
         </w:tc>
         <w:tc>
@@ -808,9 +772,6 @@
               <w:pStyle w:val="30"/>
               <w:keepNext/>
               <w:ind w:firstLine="20"/>
-              <w:rPr>
-                <w:lang w:eastAsia="zh-CN"/>
-              </w:rPr>
             </w:pPr>
           </w:p>
         </w:tc>
@@ -818,41 +779,7 @@
       <w:tr>
         <w:tc>
           <w:tcPr>
-            <w:tcW w:w="865" w:type="dxa"/>
-            <w:tcBorders>
-              <w:top w:val="none" w:sz="4" w:space="0" w:color="000000"/>
-              <w:left w:val="none" w:sz="4" w:space="0" w:color="000000"/>
-              <w:bottom w:val="none" w:sz="4" w:space="0" w:color="000000"/>
-              <w:right w:val="none" w:sz="4" w:space="0" w:color="000000"/>
-            </w:tcBorders>
-          </w:tcPr>
-          <w:p>
-            <w:pPr>
-              <w:pStyle w:val="30"/>
-              <w:keepNext/>
-            </w:pPr>
-          </w:p>
-        </w:tc>
-        <w:tc>
-          <w:tcPr>
             <w:tcW w:w="1120" w:type="dxa"/>
-            <w:tcBorders>
-              <w:top w:val="none" w:sz="4" w:space="0" w:color="000000"/>
-              <w:left w:val="none" w:sz="4" w:space="0" w:color="000000"/>
-              <w:bottom w:val="none" w:sz="4" w:space="0" w:color="000000"/>
-              <w:right w:val="none" w:sz="4" w:space="0" w:color="000000"/>
-            </w:tcBorders>
-          </w:tcPr>
-          <w:p>
-            <w:pPr>
-              <w:pStyle w:val="30"/>
-              <w:keepNext/>
-            </w:pPr>
-          </w:p>
-        </w:tc>
-        <w:tc>
-          <w:tcPr>
-            <w:tcW w:w="1417" w:type="dxa"/>
             <w:tcBorders>
               <w:top w:val="none" w:sz="4" w:space="0" w:color="000000"/>
               <w:left w:val="none" w:sz="4" w:space="0" w:color="000000"/>
@@ -905,50 +832,31 @@
             <w:vAlign w:val="bottom"/>
           </w:tcPr>
           <w:p>
+            <w:pPr>
+              <w:pStyle w:val="30"/>
+              <w:keepNext/>
+              <w:ind w:firstLine="20"/>
+              <w:rPr>
+                <w:highlight w:val="yellow"/>
+              </w:rPr>
+            </w:pPr>
+            <w:bookmarkStart w:id="2" w:name="OLE_LINK3"/>
             <w:r>
-              <w:t>{{INVENTOR}}</w:t>
+              <w:rPr>
+                <w:rFonts w:hint="eastAsia"/>
+                <w:highlight w:val="yellow"/>
+                <w:lang w:eastAsia="zh-CN"/>
+              </w:rPr>
+              <w:t>发明人打印版名字</w:t>
             </w:r>
+            <w:bookmarkEnd w:id="2"/>
           </w:p>
         </w:tc>
       </w:tr>
       <w:tr>
         <w:tc>
           <w:tcPr>
-            <w:tcW w:w="865" w:type="dxa"/>
-            <w:tcBorders>
-              <w:top w:val="none" w:sz="4" w:space="0" w:color="000000"/>
-              <w:left w:val="none" w:sz="4" w:space="0" w:color="000000"/>
-              <w:bottom w:val="none" w:sz="4" w:space="0" w:color="000000"/>
-              <w:right w:val="none" w:sz="4" w:space="0" w:color="000000"/>
-            </w:tcBorders>
-          </w:tcPr>
-          <w:p>
-            <w:pPr>
-              <w:pStyle w:val="30"/>
-              <w:keepNext/>
-            </w:pPr>
-          </w:p>
-        </w:tc>
-        <w:tc>
-          <w:tcPr>
             <w:tcW w:w="1120" w:type="dxa"/>
-            <w:tcBorders>
-              <w:top w:val="none" w:sz="4" w:space="0" w:color="000000"/>
-              <w:left w:val="none" w:sz="4" w:space="0" w:color="000000"/>
-              <w:bottom w:val="none" w:sz="4" w:space="0" w:color="000000"/>
-              <w:right w:val="none" w:sz="4" w:space="0" w:color="000000"/>
-            </w:tcBorders>
-          </w:tcPr>
-          <w:p>
-            <w:pPr>
-              <w:pStyle w:val="30"/>
-              <w:keepNext/>
-            </w:pPr>
-          </w:p>
-        </w:tc>
-        <w:tc>
-          <w:tcPr>
-            <w:tcW w:w="1417" w:type="dxa"/>
             <w:tcBorders>
               <w:top w:val="none" w:sz="4" w:space="0" w:color="000000"/>
               <w:left w:val="none" w:sz="4" w:space="0" w:color="000000"/>
@@ -1006,49 +914,35 @@
               <w:ind w:firstLine="20"/>
               <w:rPr>
                 <w:highlight w:val="yellow"/>
+                <w:lang w:eastAsia="zh-CN"/>
               </w:rPr>
             </w:pPr>
+          </w:p>
+          <w:p>
+            <w:pPr>
+              <w:pStyle w:val="30"/>
+              <w:keepNext/>
+              <w:ind w:firstLine="20"/>
+              <w:rPr>
+                <w:highlight w:val="yellow"/>
+                <w:lang w:eastAsia="zh-CN"/>
+              </w:rPr>
+            </w:pPr>
+            <w:r>
+              <w:rPr>
+                <w:rFonts w:hint="eastAsia"/>
+                <w:highlight w:val="yellow"/>
+                <w:lang w:eastAsia="zh-CN"/>
+              </w:rPr>
+              <w:t>发明人签字日期</w:t>
+            </w:r>
           </w:p>
         </w:tc>
       </w:tr>
       <w:tr>
         <w:tc>
           <w:tcPr>
-            <w:tcW w:w="865" w:type="dxa"/>
-            <w:tcBorders>
-              <w:top w:val="none" w:sz="4" w:space="0" w:color="000000"/>
-              <w:left w:val="none" w:sz="4" w:space="0" w:color="000000"/>
-              <w:bottom w:val="none" w:sz="4" w:space="0" w:color="000000"/>
-              <w:right w:val="none" w:sz="4" w:space="0" w:color="000000"/>
-            </w:tcBorders>
-          </w:tcPr>
-          <w:p>
-            <w:pPr>
-              <w:pStyle w:val="30"/>
-              <w:keepNext/>
-            </w:pPr>
-          </w:p>
-        </w:tc>
-        <w:tc>
-          <w:tcPr>
             <w:tcW w:w="1120" w:type="dxa"/>
-            <w:tcBorders>
-              <w:top w:val="none" w:sz="4" w:space="0" w:color="000000"/>
-              <w:left w:val="none" w:sz="4" w:space="0" w:color="000000"/>
-              <w:bottom w:val="none" w:sz="4" w:space="0" w:color="000000"/>
-              <w:right w:val="none" w:sz="4" w:space="0" w:color="000000"/>
-            </w:tcBorders>
-          </w:tcPr>
-          <w:p>
-            <w:pPr>
-              <w:pStyle w:val="30"/>
-              <w:keepNext/>
-            </w:pPr>
-          </w:p>
-        </w:tc>
-        <w:tc>
-          <w:tcPr>
-            <w:tcW w:w="1417" w:type="dxa"/>
             <w:tcBorders>
               <w:top w:val="none" w:sz="4" w:space="0" w:color="000000"/>
               <w:left w:val="none" w:sz="4" w:space="0" w:color="000000"/>
@@ -1101,8 +995,43 @@
             <w:vAlign w:val="bottom"/>
           </w:tcPr>
           <w:p>
+            <w:pPr>
+              <w:pStyle w:val="30"/>
+              <w:keepNext/>
+              <w:ind w:firstLine="20"/>
+              <w:rPr>
+                <w:lang w:eastAsia="zh-CN"/>
+              </w:rPr>
+            </w:pPr>
             <w:r>
-              <w:t>{{INVENTOR_ADDRESS_1}}</w:t>
+              <w:rPr>
+                <w:rFonts w:hint="eastAsia"/>
+                <w:highlight w:val="yellow"/>
+                <w:lang w:eastAsia="zh-CN"/>
+              </w:rPr>
+              <w:t>发明人地</w:t>
+            </w:r>
+            <w:r>
+              <w:rPr>
+                <w:rFonts w:hint="eastAsia"/>
+                <w:highlight w:val="yellow"/>
+                <w:lang w:eastAsia="zh-CN"/>
+              </w:rPr>
+              <w:t>址</w:t>
+            </w:r>
+            <w:r>
+              <w:rPr>
+                <w:rFonts w:hint="eastAsia"/>
+                <w:highlight w:val="yellow"/>
+                <w:lang w:eastAsia="zh-CN"/>
+              </w:rPr>
+              <w:t>1</w:t>
+            </w:r>
+            <w:r>
+              <w:rPr>
+                <w:lang w:eastAsia="zh-CN"/>
+              </w:rPr>
+              <w:t xml:space="preserve"> </w:t>
             </w:r>
           </w:p>
         </w:tc>
@@ -1110,41 +1039,7 @@
       <w:tr>
         <w:tc>
           <w:tcPr>
-            <w:tcW w:w="865" w:type="dxa"/>
-            <w:tcBorders>
-              <w:top w:val="none" w:sz="4" w:space="0" w:color="000000"/>
-              <w:left w:val="none" w:sz="4" w:space="0" w:color="000000"/>
-              <w:bottom w:val="none" w:sz="4" w:space="0" w:color="000000"/>
-              <w:right w:val="none" w:sz="4" w:space="0" w:color="000000"/>
-            </w:tcBorders>
-          </w:tcPr>
-          <w:p>
-            <w:pPr>
-              <w:pStyle w:val="30"/>
-              <w:keepNext/>
-            </w:pPr>
-          </w:p>
-        </w:tc>
-        <w:tc>
-          <w:tcPr>
             <w:tcW w:w="1120" w:type="dxa"/>
-            <w:tcBorders>
-              <w:top w:val="none" w:sz="4" w:space="0" w:color="000000"/>
-              <w:left w:val="none" w:sz="4" w:space="0" w:color="000000"/>
-              <w:bottom w:val="none" w:sz="4" w:space="0" w:color="000000"/>
-              <w:right w:val="none" w:sz="4" w:space="0" w:color="000000"/>
-            </w:tcBorders>
-          </w:tcPr>
-          <w:p>
-            <w:pPr>
-              <w:pStyle w:val="30"/>
-              <w:keepNext/>
-            </w:pPr>
-          </w:p>
-        </w:tc>
-        <w:tc>
-          <w:tcPr>
-            <w:tcW w:w="1417" w:type="dxa"/>
             <w:tcBorders>
               <w:top w:val="none" w:sz="4" w:space="0" w:color="000000"/>
               <w:left w:val="none" w:sz="4" w:space="0" w:color="000000"/>
@@ -1193,8 +1088,36 @@
             </w:tcBorders>
           </w:tcPr>
           <w:p>
+            <w:pPr>
+              <w:pStyle w:val="30"/>
+              <w:keepNext/>
+              <w:ind w:firstLine="20"/>
+              <w:rPr>
+                <w:highlight w:val="yellow"/>
+              </w:rPr>
+            </w:pPr>
+          </w:p>
+          <w:p>
+            <w:pPr>
+              <w:pStyle w:val="30"/>
+              <w:keepNext/>
+              <w:ind w:left="-14" w:firstLine="20"/>
+            </w:pPr>
             <w:r>
-              <w:t>{{INVENTOR_ADDRESS_2}}</w:t>
+              <w:rPr>
+                <w:rFonts w:hint="eastAsia"/>
+                <w:highlight w:val="yellow"/>
+                <w:lang w:eastAsia="zh-CN"/>
+              </w:rPr>
+              <w:t>发明人地址</w:t>
+            </w:r>
+            <w:r>
+              <w:rPr>
+                <w:rFonts w:hint="eastAsia"/>
+                <w:highlight w:val="yellow"/>
+                <w:lang w:eastAsia="zh-CN"/>
+              </w:rPr>
+              <w:t>2</w:t>
             </w:r>
           </w:p>
         </w:tc>
@@ -1255,30 +1178,11 @@
         <w:tblLook w:val="0000" w:firstRow="0" w:lastRow="0" w:firstColumn="0" w:lastColumn="0" w:noHBand="0" w:noVBand="0"/>
       </w:tblPr>
       <w:tblGrid>
-        <w:gridCol w:w="865"/>
         <w:gridCol w:w="1120"/>
-        <w:gridCol w:w="1417"/>
         <w:gridCol w:w="1843"/>
         <w:gridCol w:w="4394"/>
       </w:tblGrid>
       <w:tr>
-        <w:tc>
-          <w:tcPr>
-            <w:tcW w:w="865" w:type="dxa"/>
-            <w:tcBorders>
-              <w:top w:val="none" w:sz="4" w:space="0" w:color="000000"/>
-              <w:left w:val="none" w:sz="4" w:space="0" w:color="000000"/>
-              <w:bottom w:val="none" w:sz="4" w:space="0" w:color="000000"/>
-              <w:right w:val="none" w:sz="4" w:space="0" w:color="000000"/>
-            </w:tcBorders>
-          </w:tcPr>
-          <w:p>
-            <w:pPr>
-              <w:pStyle w:val="30"/>
-              <w:keepNext/>
-            </w:pPr>
-          </w:p>
-        </w:tc>
         <w:tc>
           <w:tcPr>
             <w:tcW w:w="1120" w:type="dxa"/>
@@ -1297,23 +1201,6 @@
             <w:r>
               <w:t>Assignor</w:t>
             </w:r>
-          </w:p>
-        </w:tc>
-        <w:tc>
-          <w:tcPr>
-            <w:tcW w:w="1417" w:type="dxa"/>
-            <w:tcBorders>
-              <w:top w:val="none" w:sz="4" w:space="0" w:color="000000"/>
-              <w:left w:val="none" w:sz="4" w:space="0" w:color="000000"/>
-              <w:bottom w:val="none" w:sz="4" w:space="0" w:color="000000"/>
-              <w:right w:val="none" w:sz="4" w:space="0" w:color="000000"/>
-            </w:tcBorders>
-          </w:tcPr>
-          <w:p>
-            <w:pPr>
-              <w:pStyle w:val="30"/>
-              <w:keepNext/>
-            </w:pPr>
           </w:p>
         </w:tc>
         <w:tc>
@@ -1351,9 +1238,6 @@
               <w:pStyle w:val="30"/>
               <w:keepNext/>
               <w:ind w:firstLine="20"/>
-              <w:rPr>
-                <w:lang w:eastAsia="zh-CN"/>
-              </w:rPr>
             </w:pPr>
           </w:p>
         </w:tc>
@@ -1361,41 +1245,7 @@
       <w:tr>
         <w:tc>
           <w:tcPr>
-            <w:tcW w:w="865" w:type="dxa"/>
-            <w:tcBorders>
-              <w:top w:val="none" w:sz="4" w:space="0" w:color="000000"/>
-              <w:left w:val="none" w:sz="4" w:space="0" w:color="000000"/>
-              <w:bottom w:val="none" w:sz="4" w:space="0" w:color="000000"/>
-              <w:right w:val="none" w:sz="4" w:space="0" w:color="000000"/>
-            </w:tcBorders>
-          </w:tcPr>
-          <w:p>
-            <w:pPr>
-              <w:pStyle w:val="30"/>
-              <w:keepNext/>
-            </w:pPr>
-          </w:p>
-        </w:tc>
-        <w:tc>
-          <w:tcPr>
             <w:tcW w:w="1120" w:type="dxa"/>
-            <w:tcBorders>
-              <w:top w:val="none" w:sz="4" w:space="0" w:color="000000"/>
-              <w:left w:val="none" w:sz="4" w:space="0" w:color="000000"/>
-              <w:bottom w:val="none" w:sz="4" w:space="0" w:color="000000"/>
-              <w:right w:val="none" w:sz="4" w:space="0" w:color="000000"/>
-            </w:tcBorders>
-          </w:tcPr>
-          <w:p>
-            <w:pPr>
-              <w:pStyle w:val="30"/>
-              <w:keepNext/>
-            </w:pPr>
-          </w:p>
-        </w:tc>
-        <w:tc>
-          <w:tcPr>
-            <w:tcW w:w="1417" w:type="dxa"/>
             <w:tcBorders>
               <w:top w:val="none" w:sz="4" w:space="0" w:color="000000"/>
               <w:left w:val="none" w:sz="4" w:space="0" w:color="000000"/>
@@ -1448,8 +1298,21 @@
             <w:vAlign w:val="bottom"/>
           </w:tcPr>
           <w:p>
+            <w:pPr>
+              <w:pStyle w:val="30"/>
+              <w:keepNext/>
+              <w:ind w:firstLine="20"/>
+              <w:rPr>
+                <w:highlight w:val="yellow"/>
+              </w:rPr>
+            </w:pPr>
             <w:r>
-              <w:t>{{INVENTOR}}</w:t>
+              <w:rPr>
+                <w:rFonts w:hint="eastAsia"/>
+                <w:highlight w:val="yellow"/>
+                <w:lang w:eastAsia="zh-CN"/>
+              </w:rPr>
+              <w:t>发明人打印版名字</w:t>
             </w:r>
           </w:p>
         </w:tc>
@@ -1457,41 +1320,7 @@
       <w:tr>
         <w:tc>
           <w:tcPr>
-            <w:tcW w:w="865" w:type="dxa"/>
-            <w:tcBorders>
-              <w:top w:val="none" w:sz="4" w:space="0" w:color="000000"/>
-              <w:left w:val="none" w:sz="4" w:space="0" w:color="000000"/>
-              <w:bottom w:val="none" w:sz="4" w:space="0" w:color="000000"/>
-              <w:right w:val="none" w:sz="4" w:space="0" w:color="000000"/>
-            </w:tcBorders>
-          </w:tcPr>
-          <w:p>
-            <w:pPr>
-              <w:pStyle w:val="30"/>
-              <w:keepNext/>
-            </w:pPr>
-          </w:p>
-        </w:tc>
-        <w:tc>
-          <w:tcPr>
             <w:tcW w:w="1120" w:type="dxa"/>
-            <w:tcBorders>
-              <w:top w:val="none" w:sz="4" w:space="0" w:color="000000"/>
-              <w:left w:val="none" w:sz="4" w:space="0" w:color="000000"/>
-              <w:bottom w:val="none" w:sz="4" w:space="0" w:color="000000"/>
-              <w:right w:val="none" w:sz="4" w:space="0" w:color="000000"/>
-            </w:tcBorders>
-          </w:tcPr>
-          <w:p>
-            <w:pPr>
-              <w:pStyle w:val="30"/>
-              <w:keepNext/>
-            </w:pPr>
-          </w:p>
-        </w:tc>
-        <w:tc>
-          <w:tcPr>
-            <w:tcW w:w="1417" w:type="dxa"/>
             <w:tcBorders>
               <w:top w:val="none" w:sz="4" w:space="0" w:color="000000"/>
               <w:left w:val="none" w:sz="4" w:space="0" w:color="000000"/>
@@ -1549,49 +1378,35 @@
               <w:ind w:firstLine="20"/>
               <w:rPr>
                 <w:highlight w:val="yellow"/>
+                <w:lang w:eastAsia="zh-CN"/>
               </w:rPr>
             </w:pPr>
+          </w:p>
+          <w:p>
+            <w:pPr>
+              <w:pStyle w:val="30"/>
+              <w:keepNext/>
+              <w:ind w:firstLine="20"/>
+              <w:rPr>
+                <w:highlight w:val="yellow"/>
+                <w:lang w:eastAsia="zh-CN"/>
+              </w:rPr>
+            </w:pPr>
+            <w:r>
+              <w:rPr>
+                <w:rFonts w:hint="eastAsia"/>
+                <w:highlight w:val="yellow"/>
+                <w:lang w:eastAsia="zh-CN"/>
+              </w:rPr>
+              <w:t>发明人签字日期</w:t>
+            </w:r>
           </w:p>
         </w:tc>
       </w:tr>
       <w:tr>
         <w:tc>
           <w:tcPr>
-            <w:tcW w:w="865" w:type="dxa"/>
-            <w:tcBorders>
-              <w:top w:val="none" w:sz="4" w:space="0" w:color="000000"/>
-              <w:left w:val="none" w:sz="4" w:space="0" w:color="000000"/>
-              <w:bottom w:val="none" w:sz="4" w:space="0" w:color="000000"/>
-              <w:right w:val="none" w:sz="4" w:space="0" w:color="000000"/>
-            </w:tcBorders>
-          </w:tcPr>
-          <w:p>
-            <w:pPr>
-              <w:pStyle w:val="30"/>
-              <w:keepNext/>
-            </w:pPr>
-          </w:p>
-        </w:tc>
-        <w:tc>
-          <w:tcPr>
             <w:tcW w:w="1120" w:type="dxa"/>
-            <w:tcBorders>
-              <w:top w:val="none" w:sz="4" w:space="0" w:color="000000"/>
-              <w:left w:val="none" w:sz="4" w:space="0" w:color="000000"/>
-              <w:bottom w:val="none" w:sz="4" w:space="0" w:color="000000"/>
-              <w:right w:val="none" w:sz="4" w:space="0" w:color="000000"/>
-            </w:tcBorders>
-          </w:tcPr>
-          <w:p>
-            <w:pPr>
-              <w:pStyle w:val="30"/>
-              <w:keepNext/>
-            </w:pPr>
-          </w:p>
-        </w:tc>
-        <w:tc>
-          <w:tcPr>
-            <w:tcW w:w="1417" w:type="dxa"/>
             <w:tcBorders>
               <w:top w:val="none" w:sz="4" w:space="0" w:color="000000"/>
               <w:left w:val="none" w:sz="4" w:space="0" w:color="000000"/>
@@ -1644,8 +1459,29 @@
             <w:vAlign w:val="bottom"/>
           </w:tcPr>
           <w:p>
+            <w:pPr>
+              <w:pStyle w:val="30"/>
+              <w:keepNext/>
+              <w:ind w:firstLine="20"/>
+              <w:rPr>
+                <w:lang w:eastAsia="zh-CN"/>
+              </w:rPr>
+            </w:pPr>
             <w:r>
-              <w:t>{{INVENTOR_ADDRESS_1}}</w:t>
+              <w:rPr>
+                <w:rFonts w:hint="eastAsia"/>
+                <w:highlight w:val="yellow"/>
+                <w:lang w:eastAsia="zh-CN"/>
+              </w:rPr>
+              <w:t>发明人地址</w:t>
+            </w:r>
+            <w:r>
+              <w:rPr>
+                <w:rFonts w:hint="eastAsia"/>
+                <w:highlight w:val="yellow"/>
+                <w:lang w:eastAsia="zh-CN"/>
+              </w:rPr>
+              <w:t>1</w:t>
             </w:r>
           </w:p>
         </w:tc>
@@ -1653,41 +1489,7 @@
       <w:tr>
         <w:tc>
           <w:tcPr>
-            <w:tcW w:w="865" w:type="dxa"/>
-            <w:tcBorders>
-              <w:top w:val="none" w:sz="4" w:space="0" w:color="000000"/>
-              <w:left w:val="none" w:sz="4" w:space="0" w:color="000000"/>
-              <w:bottom w:val="none" w:sz="4" w:space="0" w:color="000000"/>
-              <w:right w:val="none" w:sz="4" w:space="0" w:color="000000"/>
-            </w:tcBorders>
-          </w:tcPr>
-          <w:p>
-            <w:pPr>
-              <w:pStyle w:val="30"/>
-              <w:keepNext/>
-            </w:pPr>
-          </w:p>
-        </w:tc>
-        <w:tc>
-          <w:tcPr>
             <w:tcW w:w="1120" w:type="dxa"/>
-            <w:tcBorders>
-              <w:top w:val="none" w:sz="4" w:space="0" w:color="000000"/>
-              <w:left w:val="none" w:sz="4" w:space="0" w:color="000000"/>
-              <w:bottom w:val="none" w:sz="4" w:space="0" w:color="000000"/>
-              <w:right w:val="none" w:sz="4" w:space="0" w:color="000000"/>
-            </w:tcBorders>
-          </w:tcPr>
-          <w:p>
-            <w:pPr>
-              <w:pStyle w:val="30"/>
-              <w:keepNext/>
-            </w:pPr>
-          </w:p>
-        </w:tc>
-        <w:tc>
-          <w:tcPr>
-            <w:tcW w:w="1417" w:type="dxa"/>
             <w:tcBorders>
               <w:top w:val="none" w:sz="4" w:space="0" w:color="000000"/>
               <w:left w:val="none" w:sz="4" w:space="0" w:color="000000"/>
@@ -1736,8 +1538,36 @@
             </w:tcBorders>
           </w:tcPr>
           <w:p>
+            <w:pPr>
+              <w:pStyle w:val="30"/>
+              <w:keepNext/>
+              <w:ind w:firstLine="20"/>
+              <w:rPr>
+                <w:highlight w:val="yellow"/>
+              </w:rPr>
+            </w:pPr>
+          </w:p>
+          <w:p>
+            <w:pPr>
+              <w:pStyle w:val="30"/>
+              <w:keepNext/>
+              <w:ind w:left="-14" w:firstLine="20"/>
+            </w:pPr>
             <w:r>
-              <w:t>{{INVENTOR_ADDRESS_2}}</w:t>
+              <w:rPr>
+                <w:rFonts w:hint="eastAsia"/>
+                <w:highlight w:val="yellow"/>
+                <w:lang w:eastAsia="zh-CN"/>
+              </w:rPr>
+              <w:t>发明人地址</w:t>
+            </w:r>
+            <w:r>
+              <w:rPr>
+                <w:rFonts w:hint="eastAsia"/>
+                <w:highlight w:val="yellow"/>
+                <w:lang w:eastAsia="zh-CN"/>
+              </w:rPr>
+              <w:t>2</w:t>
             </w:r>
           </w:p>
         </w:tc>

</xml_diff>